<commit_message>
docs: upgrade project report with custom Author coordinates and embedded figures
</commit_message>
<xml_diff>
--- a/University_Project_Report.docx
+++ b/University_Project_Report.docx
@@ -4,7 +4,7 @@
   <w:body>
     <w:p>
       <w:pPr>
-        <w:spacing w:before="400" w:after="120"/>
+        <w:spacing w:before="200" w:after="120"/>
         <w:jc w:val="center"/>
       </w:pPr>
       <w:r>
@@ -19,21 +19,24 @@
     </w:p>
     <w:p>
       <w:pPr>
-        <w:spacing w:after="480"/>
+        <w:spacing w:after="400"/>
         <w:jc w:val="center"/>
       </w:pPr>
       <w:r>
         <w:rPr>
           <w:rFonts w:ascii="Times New Roman" w:hAnsi="Times New Roman"/>
-          <w:i/>
-          <w:color w:val="646464"/>
-          <w:sz w:val="22"/>
+          <w:b/>
+          <w:color w:val="323232"/>
+          <w:sz w:val="24"/>
         </w:rPr>
-        <w:t>Academic Research &amp; Project Report</w:t>
+        <w:t>Author: Guddeti Nikshitha</w:t>
         <w:br/>
-        <w:t>Course: Explainable Machine Learning &amp; Decision Systems</w:t>
+        <w:t>Roll No: 100523729087</w:t>
         <w:br/>
-        <w:t>Author: Project Mentee</w:t>
+        <w:t>Department of Artificial Intelligence &amp; Machine Learning</w:t>
+        <w:br/>
+        <w:t>Osmania University College of Engineering</w:t>
+        <w:br/>
       </w:r>
     </w:p>
     <w:p>
@@ -126,7 +129,7 @@
           <w:i w:val="0"/>
           <w:sz w:val="24"/>
         </w:rPr>
-        <w:t>Standard classification algorithms, including K-Nearest Neighbors, generate predictions by calculating metrics on multidimensional feature matrices. However, two primary challenges often limit their practical deployment. First, numerical measurements in different units or ranges introduce a scale bias, where features with larger absolute values disproportionately influence classification steps. Second, the classification outputs are purely categorical, failing to explain which biological measurements drove the classification or whether a prediction was a borderline choice. Without explaining these decisions, developers cannot audit the model's logic, and domain Experts cannot verify if the model makes decisions based on valid biological features or dataset noise.</w:t>
+        <w:t>Standard classification algorithms, including K-Nearest Neighbors, generate predictions by calculating metrics on unscaled multidimensional feature matrices. However, two primary challenges often limit their practical deployment. First, numerical measurements in different units or ranges introduce a scale bias, where features with larger absolute values disproportionately influence classification steps. Second, the classification outputs are purely categorical, failing to explain which biological measurements drove the classification or whether a prediction was a borderline choice. Without explaining these decisions, developers cannot audit the model's logic, and domain experts cannot verify if the model makes decisions based on valid biological features or dataset noise.</w:t>
       </w:r>
     </w:p>
     <w:p>
@@ -311,7 +314,47 @@
           <w:color w:val="764BA2"/>
           <w:sz w:val="28"/>
         </w:rPr>
-        <w:t>6. Data Preprocessing</w:t>
+        <w:t>6. Dataset Source</w:t>
+      </w:r>
+    </w:p>
+    <w:p>
+      <w:pPr>
+        <w:spacing w:line="276" w:lineRule="auto" w:after="160"/>
+      </w:pPr>
+      <w:r>
+        <w:rPr>
+          <w:rFonts w:ascii="Times New Roman" w:hAnsi="Times New Roman"/>
+          <w:i w:val="0"/>
+          <w:sz w:val="24"/>
+        </w:rPr>
+        <w:t>The Iris flower dataset was obtained from the Scikit-Learn datasets module (`sklearn.datasets.load_iris`).</w:t>
+        <w:br/>
+        <w:br/>
+        <w:t>Original Source:</w:t>
+        <w:br/>
+        <w:t>Fisher, R. A. (1936). The use of multiple measurements in taxonomic problems.</w:t>
+        <w:br/>
+        <w:t>UCI Machine Learning Repository: http://archive.ics.uci.edu/ml/datasets/iris</w:t>
+        <w:br/>
+        <w:t>Scikit-Learn Reference URL: https://scikit-learn.org/stable/modules/generated/sklearn.datasets.load_iris.html</w:t>
+      </w:r>
+    </w:p>
+    <w:p>
+      <w:pPr>
+        <w:keepNext/>
+        <w:spacing w:before="320" w:after="120"/>
+        <w:pBdr>
+          <w:bottom w:val="single" w:sz="6" w:space="4" w:color="764BA2"/>
+        </w:pBdr>
+      </w:pPr>
+      <w:r>
+        <w:rPr>
+          <w:rFonts w:ascii="Times New Roman" w:hAnsi="Times New Roman"/>
+          <w:b/>
+          <w:color w:val="764BA2"/>
+          <w:sz w:val="28"/>
+        </w:rPr>
+        <w:t>7. Data Preprocessing</w:t>
       </w:r>
     </w:p>
     <w:p>
@@ -342,7 +385,7 @@
           <w:color w:val="764BA2"/>
           <w:sz w:val="28"/>
         </w:rPr>
-        <w:t>7. Machine Learning Methodology</w:t>
+        <w:t>8. Machine Learning Methodology</w:t>
       </w:r>
     </w:p>
     <w:p>
@@ -432,6 +475,37 @@
     <w:p>
       <w:pPr>
         <w:keepNext/>
+        <w:spacing w:before="240" w:after="80"/>
+      </w:pPr>
+      <w:r>
+        <w:rPr>
+          <w:rFonts w:ascii="Times New Roman" w:hAnsi="Times New Roman"/>
+          <w:b/>
+          <w:color w:val="667EEA"/>
+          <w:sz w:val="25"/>
+        </w:rPr>
+        <w:t>Pipeline Architecture Workflow</w:t>
+      </w:r>
+    </w:p>
+    <w:p>
+      <w:pPr>
+        <w:spacing w:line="276" w:lineRule="auto" w:after="160"/>
+      </w:pPr>
+      <w:r>
+        <w:rPr>
+          <w:rFonts w:ascii="Times New Roman" w:hAnsi="Times New Roman"/>
+          <w:i w:val="0"/>
+          <w:sz w:val="24"/>
+        </w:rPr>
+        <w:t>The flow of operations is structured sequentially, preventing data leakage and guaranteeing standardized parameters are applied automatically to every user request:</w:t>
+        <w:br/>
+        <w:br/>
+        <w:t>User Inputs ➔ Flask Web Application ➔ StandardScaler Scaling ➔ Weighted KNN Classification ➔ Prediction Categorization ➔ LIME Explainer ➔ Interpretation Narrative Engine ➔ Interactive HTML Dashboard Dashboard</w:t>
+      </w:r>
+    </w:p>
+    <w:p>
+      <w:pPr>
+        <w:keepNext/>
         <w:spacing w:before="320" w:after="120"/>
         <w:pBdr>
           <w:bottom w:val="single" w:sz="6" w:space="4" w:color="764BA2"/>
@@ -444,7 +518,7 @@
           <w:color w:val="764BA2"/>
           <w:sz w:val="28"/>
         </w:rPr>
-        <w:t>8. Model Evaluation</w:t>
+        <w:t>9. Model Evaluation</w:t>
       </w:r>
     </w:p>
     <w:p>
@@ -457,7 +531,7 @@
           <w:i w:val="0"/>
           <w:sz w:val="24"/>
         </w:rPr>
-        <w:t>The pipeline is evaluated on a stratified 20% validation split (30 samples) to ensure equal representation. The model achieves an overall accuracy of 96.67%. The table below details the performance metrics across all three classes:</w:t>
+        <w:t>Rescaled parameters were evaluated on a stratified 20% validation split (30 samples) to ensure equal representation. The model achieves an overall accuracy of 96.67%. The table below details the performance metrics across all three classes:</w:t>
       </w:r>
     </w:p>
     <w:tbl>
@@ -807,6 +881,21 @@
     <w:p/>
     <w:p>
       <w:pPr>
+        <w:keepNext/>
+        <w:spacing w:before="240" w:after="80"/>
+      </w:pPr>
+      <w:r>
+        <w:rPr>
+          <w:rFonts w:ascii="Times New Roman" w:hAnsi="Times New Roman"/>
+          <w:b/>
+          <w:color w:val="667EEA"/>
+          <w:sz w:val="25"/>
+        </w:rPr>
+        <w:t>Confusion Matrix Analysis</w:t>
+      </w:r>
+    </w:p>
+    <w:p>
+      <w:pPr>
         <w:spacing w:line="276" w:lineRule="auto" w:after="160"/>
       </w:pPr>
       <w:r>
@@ -815,274 +904,62 @@
           <w:i w:val="0"/>
           <w:sz w:val="24"/>
         </w:rPr>
-        <w:t>Confusion Matrix configuration:</w:t>
+        <w:t>The confusion matrix diagram demonstrates that the setosa class (10 samples) and virginica class (10 samples) were classified with 100% precision. Only one versicolor sample was misclassified as virginica due to local proximity in the overlapping feature space.</w:t>
       </w:r>
     </w:p>
-    <w:tbl>
-      <w:tblPr>
-        <w:tblW w:type="auto" w:w="0"/>
+    <w:p>
+      <w:pPr>
         <w:jc w:val="center"/>
-        <w:tblLook w:firstColumn="1" w:firstRow="1" w:lastColumn="0" w:lastRow="0" w:noHBand="0" w:noVBand="1" w:val="04A0"/>
-      </w:tblPr>
-      <w:tblGrid>
-        <w:gridCol w:w="2340"/>
-        <w:gridCol w:w="2340"/>
-        <w:gridCol w:w="2340"/>
-        <w:gridCol w:w="2340"/>
-      </w:tblGrid>
-      <w:tr>
-        <w:tc>
-          <w:tcPr>
-            <w:tcW w:type="dxa" w:w="2340"/>
-            <w:shd w:fill="F8F9FA"/>
-          </w:tcPr>
-          <w:p>
-            <w:r>
-              <w:rPr>
-                <w:rFonts w:ascii="Times New Roman" w:hAnsi="Times New Roman"/>
-                <w:b/>
-              </w:rPr>
-              <w:t>True / Predicted</w:t>
-            </w:r>
-          </w:p>
-        </w:tc>
-        <w:tc>
-          <w:tcPr>
-            <w:tcW w:type="dxa" w:w="2340"/>
-            <w:shd w:fill="F8F9FA"/>
-          </w:tcPr>
-          <w:p>
-            <w:r>
-              <w:rPr>
-                <w:rFonts w:ascii="Times New Roman" w:hAnsi="Times New Roman"/>
-                <w:b/>
-              </w:rPr>
-              <w:t>Setosa</w:t>
-            </w:r>
-          </w:p>
-        </w:tc>
-        <w:tc>
-          <w:tcPr>
-            <w:tcW w:type="dxa" w:w="2340"/>
-            <w:shd w:fill="F8F9FA"/>
-          </w:tcPr>
-          <w:p>
-            <w:r>
-              <w:rPr>
-                <w:rFonts w:ascii="Times New Roman" w:hAnsi="Times New Roman"/>
-                <w:b/>
-              </w:rPr>
-              <w:t>Versicolor</w:t>
-            </w:r>
-          </w:p>
-        </w:tc>
-        <w:tc>
-          <w:tcPr>
-            <w:tcW w:type="dxa" w:w="2340"/>
-            <w:shd w:fill="F8F9FA"/>
-          </w:tcPr>
-          <w:p>
-            <w:r>
-              <w:rPr>
-                <w:rFonts w:ascii="Times New Roman" w:hAnsi="Times New Roman"/>
-                <w:b/>
-              </w:rPr>
-              <w:t>Virginica</w:t>
-            </w:r>
-          </w:p>
-        </w:tc>
-      </w:tr>
-      <w:tr>
-        <w:tc>
-          <w:tcPr>
-            <w:tcW w:type="dxa" w:w="2340"/>
-          </w:tcPr>
-          <w:p>
-            <w:r>
-              <w:rPr>
-                <w:rFonts w:ascii="Times New Roman" w:hAnsi="Times New Roman"/>
-              </w:rPr>
-              <w:t>Setosa</w:t>
-            </w:r>
-          </w:p>
-        </w:tc>
-        <w:tc>
-          <w:tcPr>
-            <w:tcW w:type="dxa" w:w="2340"/>
-          </w:tcPr>
-          <w:p>
-            <w:pPr>
-              <w:jc w:val="center"/>
-            </w:pPr>
-            <w:r>
-              <w:rPr>
-                <w:rFonts w:ascii="Times New Roman" w:hAnsi="Times New Roman"/>
-              </w:rPr>
-              <w:t>10</w:t>
-            </w:r>
-          </w:p>
-        </w:tc>
-        <w:tc>
-          <w:tcPr>
-            <w:tcW w:type="dxa" w:w="2340"/>
-          </w:tcPr>
-          <w:p>
-            <w:pPr>
-              <w:jc w:val="center"/>
-            </w:pPr>
-            <w:r>
-              <w:rPr>
-                <w:rFonts w:ascii="Times New Roman" w:hAnsi="Times New Roman"/>
-              </w:rPr>
-              <w:t>0</w:t>
-            </w:r>
-          </w:p>
-        </w:tc>
-        <w:tc>
-          <w:tcPr>
-            <w:tcW w:type="dxa" w:w="2340"/>
-          </w:tcPr>
-          <w:p>
-            <w:pPr>
-              <w:jc w:val="center"/>
-            </w:pPr>
-            <w:r>
-              <w:rPr>
-                <w:rFonts w:ascii="Times New Roman" w:hAnsi="Times New Roman"/>
-              </w:rPr>
-              <w:t>0</w:t>
-            </w:r>
-          </w:p>
-        </w:tc>
-      </w:tr>
-      <w:tr>
-        <w:tc>
-          <w:tcPr>
-            <w:tcW w:type="dxa" w:w="2340"/>
-          </w:tcPr>
-          <w:p>
-            <w:r>
-              <w:rPr>
-                <w:rFonts w:ascii="Times New Roman" w:hAnsi="Times New Roman"/>
-              </w:rPr>
-              <w:t>Versicolor</w:t>
-            </w:r>
-          </w:p>
-        </w:tc>
-        <w:tc>
-          <w:tcPr>
-            <w:tcW w:type="dxa" w:w="2340"/>
-          </w:tcPr>
-          <w:p>
-            <w:pPr>
-              <w:jc w:val="center"/>
-            </w:pPr>
-            <w:r>
-              <w:rPr>
-                <w:rFonts w:ascii="Times New Roman" w:hAnsi="Times New Roman"/>
-              </w:rPr>
-              <w:t>0</w:t>
-            </w:r>
-          </w:p>
-        </w:tc>
-        <w:tc>
-          <w:tcPr>
-            <w:tcW w:type="dxa" w:w="2340"/>
-          </w:tcPr>
-          <w:p>
-            <w:pPr>
-              <w:jc w:val="center"/>
-            </w:pPr>
-            <w:r>
-              <w:rPr>
-                <w:rFonts w:ascii="Times New Roman" w:hAnsi="Times New Roman"/>
-              </w:rPr>
-              <w:t>9</w:t>
-            </w:r>
-          </w:p>
-        </w:tc>
-        <w:tc>
-          <w:tcPr>
-            <w:tcW w:type="dxa" w:w="2340"/>
-          </w:tcPr>
-          <w:p>
-            <w:pPr>
-              <w:jc w:val="center"/>
-            </w:pPr>
-            <w:r>
-              <w:rPr>
-                <w:rFonts w:ascii="Times New Roman" w:hAnsi="Times New Roman"/>
-              </w:rPr>
-              <w:t>1</w:t>
-            </w:r>
-          </w:p>
-        </w:tc>
-      </w:tr>
-      <w:tr>
-        <w:tc>
-          <w:tcPr>
-            <w:tcW w:type="dxa" w:w="2340"/>
-          </w:tcPr>
-          <w:p>
-            <w:r>
-              <w:rPr>
-                <w:rFonts w:ascii="Times New Roman" w:hAnsi="Times New Roman"/>
-              </w:rPr>
-              <w:t>Virginica</w:t>
-            </w:r>
-          </w:p>
-        </w:tc>
-        <w:tc>
-          <w:tcPr>
-            <w:tcW w:type="dxa" w:w="2340"/>
-          </w:tcPr>
-          <w:p>
-            <w:pPr>
-              <w:jc w:val="center"/>
-            </w:pPr>
-            <w:r>
-              <w:rPr>
-                <w:rFonts w:ascii="Times New Roman" w:hAnsi="Times New Roman"/>
-              </w:rPr>
-              <w:t>0</w:t>
-            </w:r>
-          </w:p>
-        </w:tc>
-        <w:tc>
-          <w:tcPr>
-            <w:tcW w:type="dxa" w:w="2340"/>
-          </w:tcPr>
-          <w:p>
-            <w:pPr>
-              <w:jc w:val="center"/>
-            </w:pPr>
-            <w:r>
-              <w:rPr>
-                <w:rFonts w:ascii="Times New Roman" w:hAnsi="Times New Roman"/>
-              </w:rPr>
-              <w:t>0</w:t>
-            </w:r>
-          </w:p>
-        </w:tc>
-        <w:tc>
-          <w:tcPr>
-            <w:tcW w:type="dxa" w:w="2340"/>
-          </w:tcPr>
-          <w:p>
-            <w:pPr>
-              <w:jc w:val="center"/>
-            </w:pPr>
-            <w:r>
-              <w:rPr>
-                <w:rFonts w:ascii="Times New Roman" w:hAnsi="Times New Roman"/>
-              </w:rPr>
-              <w:t>10</w:t>
-            </w:r>
-          </w:p>
-        </w:tc>
-      </w:tr>
-    </w:tbl>
-    <w:p/>
+      </w:pPr>
+      <w:r>
+        <w:drawing>
+          <wp:inline xmlns:a="http://schemas.openxmlformats.org/drawingml/2006/main" xmlns:pic="http://schemas.openxmlformats.org/drawingml/2006/picture">
+            <wp:extent cx="4114800" cy="3291840"/>
+            <wp:docPr id="1" name="Picture 1"/>
+            <wp:cNvGraphicFramePr>
+              <a:graphicFrameLocks noChangeAspect="1"/>
+            </wp:cNvGraphicFramePr>
+            <a:graphic>
+              <a:graphicData uri="http://schemas.openxmlformats.org/drawingml/2006/picture">
+                <pic:pic>
+                  <pic:nvPicPr>
+                    <pic:cNvPr id="0" name="confusion_matrix_plot.png"/>
+                    <pic:cNvPicPr/>
+                  </pic:nvPicPr>
+                  <pic:blipFill>
+                    <a:blip r:embed="rId9"/>
+                    <a:stretch>
+                      <a:fillRect/>
+                    </a:stretch>
+                  </pic:blipFill>
+                  <pic:spPr>
+                    <a:xfrm>
+                      <a:off x="0" y="0"/>
+                      <a:ext cx="4114800" cy="3291840"/>
+                    </a:xfrm>
+                    <a:prstGeom prst="rect"/>
+                  </pic:spPr>
+                </pic:pic>
+              </a:graphicData>
+            </a:graphic>
+          </wp:inline>
+        </w:drawing>
+      </w:r>
+    </w:p>
+    <w:p>
+      <w:pPr>
+        <w:spacing w:after="240"/>
+        <w:jc w:val="center"/>
+      </w:pPr>
+      <w:r>
+        <w:rPr>
+          <w:rFonts w:ascii="Times New Roman" w:hAnsi="Times New Roman"/>
+          <w:i/>
+          <w:sz w:val="21"/>
+        </w:rPr>
+        <w:t>Figure 1: Confusion Matrix of the Stratified KNN Model Pipeline</w:t>
+      </w:r>
+    </w:p>
     <w:p>
       <w:pPr>
         <w:keepNext/>
@@ -1098,7 +975,7 @@
           <w:color w:val="764BA2"/>
           <w:sz w:val="28"/>
         </w:rPr>
-        <w:t>9. Explainable AI (XAI)</w:t>
+        <w:t>10. Explainable AI (XAI)</w:t>
       </w:r>
     </w:p>
     <w:p>
@@ -1200,7 +1077,7 @@
           <w:color w:val="764BA2"/>
           <w:sz w:val="28"/>
         </w:rPr>
-        <w:t>10. Results and Web Application Interface</w:t>
+        <w:t>11. Results and Web Application Interface</w:t>
       </w:r>
     </w:p>
     <w:p>
@@ -1321,6 +1198,60 @@
         <w:t>• The UI renders a two-column dashboard showing prediction details, narrative interpretations, and LIME charts.</w:t>
       </w:r>
     </w:p>
+    <w:p/>
+    <w:p>
+      <w:pPr>
+        <w:jc w:val="center"/>
+      </w:pPr>
+      <w:r>
+        <w:drawing>
+          <wp:inline xmlns:a="http://schemas.openxmlformats.org/drawingml/2006/main" xmlns:pic="http://schemas.openxmlformats.org/drawingml/2006/picture">
+            <wp:extent cx="5486400" cy="2508885"/>
+            <wp:docPr id="2" name="Picture 2"/>
+            <wp:cNvGraphicFramePr>
+              <a:graphicFrameLocks noChangeAspect="1"/>
+            </wp:cNvGraphicFramePr>
+            <a:graphic>
+              <a:graphicData uri="http://schemas.openxmlformats.org/drawingml/2006/picture">
+                <pic:pic>
+                  <pic:nvPicPr>
+                    <pic:cNvPr id="0" name="prediction_result_interpretation_1785951207916.png"/>
+                    <pic:cNvPicPr/>
+                  </pic:nvPicPr>
+                  <pic:blipFill>
+                    <a:blip r:embed="rId10"/>
+                    <a:stretch>
+                      <a:fillRect/>
+                    </a:stretch>
+                  </pic:blipFill>
+                  <pic:spPr>
+                    <a:xfrm>
+                      <a:off x="0" y="0"/>
+                      <a:ext cx="5486400" cy="2508885"/>
+                    </a:xfrm>
+                    <a:prstGeom prst="rect"/>
+                  </pic:spPr>
+                </pic:pic>
+              </a:graphicData>
+            </a:graphic>
+          </wp:inline>
+        </w:drawing>
+      </w:r>
+    </w:p>
+    <w:p>
+      <w:pPr>
+        <w:spacing w:after="240"/>
+        <w:jc w:val="center"/>
+      </w:pPr>
+      <w:r>
+        <w:rPr>
+          <w:rFonts w:ascii="Times New Roman" w:hAnsi="Times New Roman"/>
+          <w:i/>
+          <w:sz w:val="21"/>
+        </w:rPr>
+        <w:t>Figure 2: Final Explainable AI Dashboard showing Virginica (Low Trust Prediction)</w:t>
+      </w:r>
+    </w:p>
     <w:p>
       <w:pPr>
         <w:keepNext/>
@@ -1336,7 +1267,7 @@
           <w:color w:val="764BA2"/>
           <w:sz w:val="28"/>
         </w:rPr>
-        <w:t>11. Interpretative Analysis Case Study</w:t>
+        <w:t>12. Interpretative Analysis Case Study</w:t>
       </w:r>
     </w:p>
     <w:p>
@@ -1478,6 +1409,60 @@
         <w:t>A key limitation of LIME is instability, as the random perturbations can lead to minor variations in feature weights between runs on the same input.</w:t>
       </w:r>
     </w:p>
+    <w:p/>
+    <w:p>
+      <w:pPr>
+        <w:jc w:val="center"/>
+      </w:pPr>
+      <w:r>
+        <w:drawing>
+          <wp:inline xmlns:a="http://schemas.openxmlformats.org/drawingml/2006/main" xmlns:pic="http://schemas.openxmlformats.org/drawingml/2006/picture">
+            <wp:extent cx="5303520" cy="2425256"/>
+            <wp:docPr id="3" name="Picture 3"/>
+            <wp:cNvGraphicFramePr>
+              <a:graphicFrameLocks noChangeAspect="1"/>
+            </wp:cNvGraphicFramePr>
+            <a:graphic>
+              <a:graphicData uri="http://schemas.openxmlformats.org/drawingml/2006/picture">
+                <pic:pic>
+                  <pic:nvPicPr>
+                    <pic:cNvPr id="0" name="lime_explanation_1785952352698.png"/>
+                    <pic:cNvPicPr/>
+                  </pic:nvPicPr>
+                  <pic:blipFill>
+                    <a:blip r:embed="rId11"/>
+                    <a:stretch>
+                      <a:fillRect/>
+                    </a:stretch>
+                  </pic:blipFill>
+                  <pic:spPr>
+                    <a:xfrm>
+                      <a:off x="0" y="0"/>
+                      <a:ext cx="5303520" cy="2425256"/>
+                    </a:xfrm>
+                    <a:prstGeom prst="rect"/>
+                  </pic:spPr>
+                </pic:pic>
+              </a:graphicData>
+            </a:graphic>
+          </wp:inline>
+        </w:drawing>
+      </w:r>
+    </w:p>
+    <w:p>
+      <w:pPr>
+        <w:spacing w:after="240"/>
+        <w:jc w:val="center"/>
+      </w:pPr>
+      <w:r>
+        <w:rPr>
+          <w:rFonts w:ascii="Times New Roman" w:hAnsi="Times New Roman"/>
+          <w:i/>
+          <w:sz w:val="21"/>
+        </w:rPr>
+        <w:t>Figure 3: LIME Explanation Local Feature Contributions Chart</w:t>
+      </w:r>
+    </w:p>
     <w:p>
       <w:pPr>
         <w:keepNext/>
@@ -1493,7 +1478,7 @@
           <w:color w:val="764BA2"/>
           <w:sz w:val="28"/>
         </w:rPr>
-        <w:t>12. Conclusion</w:t>
+        <w:t>13. Conclusion</w:t>
       </w:r>
     </w:p>
     <w:p>
@@ -1512,6 +1497,36 @@
     <w:p>
       <w:pPr>
         <w:keepNext/>
+        <w:spacing w:before="240" w:after="80"/>
+      </w:pPr>
+      <w:r>
+        <w:rPr>
+          <w:rFonts w:ascii="Times New Roman" w:hAnsi="Times New Roman"/>
+          <w:b/>
+          <w:color w:val="667EEA"/>
+          <w:sz w:val="25"/>
+        </w:rPr>
+        <w:t>GitHub Repository Location</w:t>
+      </w:r>
+    </w:p>
+    <w:p>
+      <w:pPr>
+        <w:spacing w:line="276" w:lineRule="auto" w:after="160"/>
+      </w:pPr>
+      <w:r>
+        <w:rPr>
+          <w:rFonts w:ascii="Times New Roman" w:hAnsi="Times New Roman"/>
+          <w:i w:val="0"/>
+          <w:sz w:val="24"/>
+        </w:rPr>
+        <w:t>To support transparency and open science initiatives, the execution codebase, models, static configurations, and integration pipelines are versioned on GitHub:</w:t>
+        <w:br/>
+        <w:t>https://github.com/Nikshitha33/irisclassification-</w:t>
+      </w:r>
+    </w:p>
+    <w:p>
+      <w:pPr>
+        <w:keepNext/>
         <w:spacing w:before="320" w:after="120"/>
         <w:pBdr>
           <w:bottom w:val="single" w:sz="6" w:space="4" w:color="764BA2"/>
@@ -1524,7 +1539,7 @@
           <w:color w:val="764BA2"/>
           <w:sz w:val="28"/>
         </w:rPr>
-        <w:t>13. Future Scope</w:t>
+        <w:t>14. Future Scope</w:t>
       </w:r>
     </w:p>
     <w:p>
@@ -1555,7 +1570,7 @@
           <w:color w:val="764BA2"/>
           <w:sz w:val="28"/>
         </w:rPr>
-        <w:t>14. References</w:t>
+        <w:t>15. References</w:t>
       </w:r>
     </w:p>
     <w:p>

</xml_diff>

<commit_message>
docs: adjust Figure 3 caption to explicitly read 'Feature Importance Plot'
</commit_message>
<xml_diff>
--- a/University_Project_Report.docx
+++ b/University_Project_Report.docx
@@ -500,7 +500,7 @@
         <w:t>The flow of operations is structured sequentially, preventing data leakage and guaranteeing standardized parameters are applied automatically to every user request:</w:t>
         <w:br/>
         <w:br/>
-        <w:t>User Inputs ➔ Flask Web Application ➔ StandardScaler Scaling ➔ Weighted KNN Classification ➔ Prediction Categorization ➔ LIME Explainer ➔ Interpretation Narrative Engine ➔ Interactive HTML Dashboard Dashboard</w:t>
+        <w:t>User Inputs ➔ Flask Web Application ➔ StandardScaler Scaling ➔ Weighted KNN Classification ➔ Prediction Categorization ➔ LIME Explainer ➔ Interpretation Narrative Engine ➔ Interactive HTML Dashboard</w:t>
       </w:r>
     </w:p>
     <w:p>
@@ -1460,7 +1460,7 @@
           <w:i/>
           <w:sz w:val="21"/>
         </w:rPr>
-        <w:t>Figure 3: LIME Explanation Local Feature Contributions Chart</w:t>
+        <w:t>Figure 3: Feature Importance Plot (Generated using LIME)</w:t>
       </w:r>
     </w:p>
     <w:p>

</xml_diff>